<commit_message>
Configure Azure PostgreSQL database connection
</commit_message>
<xml_diff>
--- a/VoyageIQ Documentation.docx
+++ b/VoyageIQ Documentation.docx
@@ -1,6 +1,6 @@
 
 <file path=word/document.xml><?xml version="1.0" encoding="utf-8"?>
-<w:document xmlns:wpc="http://schemas.microsoft.com/office/word/2010/wordprocessingCanvas" xmlns:cx="http://schemas.microsoft.com/office/drawing/2014/chartex" xmlns:cx1="http://schemas.microsoft.com/office/drawing/2015/9/8/chartex" xmlns:cx2="http://schemas.microsoft.com/office/drawing/2015/10/21/chartex" xmlns:cx3="http://schemas.microsoft.com/office/drawing/2016/5/9/chartex" xmlns:cx4="http://schemas.microsoft.com/office/drawing/2016/5/10/chartex" xmlns:cx5="http://schemas.microsoft.com/office/drawing/2016/5/11/chartex" xmlns:cx6="http://schemas.microsoft.com/office/drawing/2016/5/12/chartex" xmlns:cx7="http://schemas.microsoft.com/office/drawing/2016/5/13/chartex" xmlns:cx8="http://schemas.microsoft.com/office/drawing/2016/5/14/chartex" xmlns:mc="http://schemas.openxmlformats.org/markup-compatibility/2006" xmlns:aink="http://schemas.microsoft.com/office/drawing/2016/ink" xmlns:am3d="http://schemas.microsoft.com/office/drawing/2017/model3d" xmlns:o="urn:schemas-microsoft-com:office:office" xmlns:oel="http://schemas.microsoft.com/office/2019/extlst" xmlns:r="http://schemas.openxmlformats.org/officeDocument/2006/relationships" xmlns:m="http://schemas.openxmlformats.org/officeDocument/2006/math" xmlns:v="urn:schemas-microsoft-com:vml" xmlns:wp14="http://schemas.microsoft.com/office/word/2010/wordprocessingDrawing" xmlns:wp="http://schemas.openxmlformats.org/drawingml/2006/wordprocessingDrawing" xmlns:w10="urn:schemas-microsoft-com:office:word" xmlns:w="http://schemas.openxmlformats.org/wordprocessingml/2006/main" xmlns:w14="http://schemas.microsoft.com/office/word/2010/wordml" xmlns:w15="http://schemas.microsoft.com/office/word/2012/wordml" xmlns:w16cex="http://schemas.microsoft.com/office/word/2018/wordml/cex" xmlns:w16cid="http://schemas.microsoft.com/office/word/2016/wordml/cid" xmlns:w16="http://schemas.microsoft.com/office/word/2018/wordml" xmlns:w16du="http://schemas.microsoft.com/office/word/2023/wordml/word16du" xmlns:w16sdtdh="http://schemas.microsoft.com/office/word/2020/wordml/sdtdatahash" xmlns:w16sdtfl="http://schemas.microsoft.com/office/word/2024/wordml/sdtformatlock" xmlns:w16se="http://schemas.microsoft.com/office/word/2015/wordml/symex" xmlns:wpg="http://schemas.microsoft.com/office/word/2010/wordprocessingGroup" xmlns:wpi="http://schemas.microsoft.com/office/word/2010/wordprocessingInk" xmlns:wne="http://schemas.microsoft.com/office/word/2006/wordml" xmlns:wps="http://schemas.microsoft.com/office/word/2010/wordprocessingShape" mc:Ignorable="w14 w15 w16se w16cid w16 w16cex w16sdtdh w16sdtfl w16du wp14">
+<w:document xmlns:wpc="http://schemas.microsoft.com/office/word/2010/wordprocessingCanvas" xmlns:cx="http://schemas.microsoft.com/office/drawing/2014/chartex" xmlns:cx1="http://schemas.microsoft.com/office/drawing/2015/9/8/chartex" xmlns:cx2="http://schemas.microsoft.com/office/drawing/2015/10/21/chartex" xmlns:cx3="http://schemas.microsoft.com/office/drawing/2016/5/9/chartex" xmlns:cx4="http://schemas.microsoft.com/office/drawing/2016/5/10/chartex" xmlns:cx5="http://schemas.microsoft.com/office/drawing/2016/5/11/chartex" xmlns:cx6="http://schemas.microsoft.com/office/drawing/2016/5/12/chartex" xmlns:cx7="http://schemas.microsoft.com/office/drawing/2016/5/13/chartex" xmlns:cx8="http://schemas.microsoft.com/office/drawing/2016/5/14/chartex" xmlns:mc="http://schemas.openxmlformats.org/markup-compatibility/2006" xmlns:aink="http://schemas.microsoft.com/office/drawing/2016/ink" xmlns:am3d="http://schemas.microsoft.com/office/drawing/2017/model3d" xmlns:o="urn:schemas-microsoft-com:office:office" xmlns:oel="http://schemas.microsoft.com/office/2019/extlst" xmlns:r="http://schemas.openxmlformats.org/officeDocument/2006/relationships" xmlns:m="http://schemas.openxmlformats.org/officeDocument/2006/math" xmlns:v="urn:schemas-microsoft-com:vml" xmlns:wp14="http://schemas.microsoft.com/office/word/2010/wordprocessingDrawing" xmlns:wp="http://schemas.openxmlformats.org/drawingml/2006/wordprocessingDrawing" xmlns:w10="urn:schemas-microsoft-com:office:word" xmlns:w="http://schemas.openxmlformats.org/wordprocessingml/2006/main" xmlns:w14="http://schemas.microsoft.com/office/word/2010/wordml" xmlns:w15="http://schemas.microsoft.com/office/word/2012/wordml" xmlns:w16cei="http://schemas.microsoft.com/office/word/2026/wordml/cei" xmlns:w16cex="http://schemas.microsoft.com/office/word/2018/wordml/cex" xmlns:w16cid="http://schemas.microsoft.com/office/word/2016/wordml/cid" xmlns:w16="http://schemas.microsoft.com/office/word/2018/wordml" xmlns:w16du="http://schemas.microsoft.com/office/word/2023/wordml/word16du" xmlns:w16sdtdh="http://schemas.microsoft.com/office/word/2020/wordml/sdtdatahash" xmlns:w16sdtfl="http://schemas.microsoft.com/office/word/2024/wordml/sdtformatlock" xmlns:w16se="http://schemas.microsoft.com/office/word/2015/wordml/symex" xmlns:wpg="http://schemas.microsoft.com/office/word/2010/wordprocessingGroup" xmlns:wpi="http://schemas.microsoft.com/office/word/2010/wordprocessingInk" xmlns:wne="http://schemas.microsoft.com/office/word/2006/wordml" xmlns:wps="http://schemas.microsoft.com/office/word/2010/wordprocessingShape" mc:Ignorable="w14 w15 w16se w16cid w16 w16cex w16sdtdh w16sdtfl w16du wp14">
   <w:body>
     <w:p>
       <w:pPr>
@@ -110,19 +110,28 @@
           <w:szCs w:val="28"/>
           <w:lang w:val="en-US"/>
         </w:rPr>
-        <w:t xml:space="preserve">Project Name - </w:t>
-      </w:r>
-      <w:proofErr w:type="spellStart"/>
-      <w:r>
+        <w:t>Project Name - VoyageIQ</w:t>
+      </w:r>
+    </w:p>
+    <w:p>
+      <w:pPr>
+        <w:ind w:left="720"/>
         <w:rPr>
           <w:color w:val="000000" w:themeColor="text1"/>
           <w:sz w:val="28"/>
           <w:szCs w:val="28"/>
           <w:lang w:val="en-US"/>
         </w:rPr>
-        <w:t>VoyageIQ</w:t>
-      </w:r>
-      <w:proofErr w:type="spellEnd"/>
+      </w:pPr>
+      <w:r>
+        <w:rPr>
+          <w:color w:val="000000" w:themeColor="text1"/>
+          <w:sz w:val="28"/>
+          <w:szCs w:val="28"/>
+          <w:lang w:val="en-US"/>
+        </w:rPr>
+        <w:t>Project Type – Travel Decision Intelligence Platform</w:t>
+      </w:r>
     </w:p>
     <w:p>
       <w:pPr>
@@ -131,17 +140,24 @@
           <w:color w:val="000000" w:themeColor="text1"/>
           <w:sz w:val="28"/>
           <w:szCs w:val="28"/>
+        </w:rPr>
+      </w:pPr>
+      <w:r>
+        <w:rPr>
+          <w:color w:val="000000" w:themeColor="text1"/>
+          <w:sz w:val="28"/>
+          <w:szCs w:val="28"/>
           <w:lang w:val="en-US"/>
         </w:rPr>
-      </w:pPr>
-      <w:r>
-        <w:rPr>
-          <w:color w:val="000000" w:themeColor="text1"/>
-          <w:sz w:val="28"/>
-          <w:szCs w:val="28"/>
-          <w:lang w:val="en-US"/>
-        </w:rPr>
-        <w:t>Project Type – Travel Decision Intelligence Platform</w:t>
+        <w:t xml:space="preserve">Project Description - </w:t>
+      </w:r>
+      <w:r>
+        <w:rPr>
+          <w:color w:val="000000" w:themeColor="text1"/>
+          <w:sz w:val="28"/>
+          <w:szCs w:val="28"/>
+        </w:rPr>
+        <w:t>VoyageIQ is a web-based travel intelligence platform designed to help travelers make better travel decisions before booking their trips.</w:t>
       </w:r>
     </w:p>
     <w:p>
@@ -158,81 +174,8 @@
           <w:color w:val="000000" w:themeColor="text1"/>
           <w:sz w:val="28"/>
           <w:szCs w:val="28"/>
-          <w:lang w:val="en-US"/>
-        </w:rPr>
-        <w:t xml:space="preserve">Project Description - </w:t>
-      </w:r>
-      <w:proofErr w:type="spellStart"/>
-      <w:r>
-        <w:rPr>
-          <w:color w:val="000000" w:themeColor="text1"/>
-          <w:sz w:val="28"/>
-          <w:szCs w:val="28"/>
-        </w:rPr>
-        <w:t>VoyageIQ</w:t>
-      </w:r>
-      <w:proofErr w:type="spellEnd"/>
-      <w:r>
-        <w:rPr>
-          <w:color w:val="000000" w:themeColor="text1"/>
-          <w:sz w:val="28"/>
-          <w:szCs w:val="28"/>
-        </w:rPr>
-        <w:t xml:space="preserve"> is a web-based travel intelligence platform designed to help </w:t>
-      </w:r>
-      <w:proofErr w:type="spellStart"/>
-      <w:r>
-        <w:rPr>
-          <w:color w:val="000000" w:themeColor="text1"/>
-          <w:sz w:val="28"/>
-          <w:szCs w:val="28"/>
-        </w:rPr>
-        <w:t>travelers</w:t>
-      </w:r>
-      <w:proofErr w:type="spellEnd"/>
-      <w:r>
-        <w:rPr>
-          <w:color w:val="000000" w:themeColor="text1"/>
-          <w:sz w:val="28"/>
-          <w:szCs w:val="28"/>
-        </w:rPr>
-        <w:t xml:space="preserve"> make better travel decisions before booking their trips.</w:t>
-      </w:r>
-    </w:p>
-    <w:p>
-      <w:pPr>
-        <w:ind w:left="720"/>
-        <w:rPr>
-          <w:color w:val="000000" w:themeColor="text1"/>
-          <w:sz w:val="28"/>
-          <w:szCs w:val="28"/>
-        </w:rPr>
-      </w:pPr>
-      <w:r>
-        <w:rPr>
-          <w:color w:val="000000" w:themeColor="text1"/>
-          <w:sz w:val="28"/>
-          <w:szCs w:val="28"/>
-        </w:rPr>
-        <w:t xml:space="preserve">Unlike traditional travel booking websites, </w:t>
-      </w:r>
-      <w:proofErr w:type="spellStart"/>
-      <w:r>
-        <w:rPr>
-          <w:color w:val="000000" w:themeColor="text1"/>
-          <w:sz w:val="28"/>
-          <w:szCs w:val="28"/>
-        </w:rPr>
-        <w:t>VoyageIQ</w:t>
-      </w:r>
-      <w:proofErr w:type="spellEnd"/>
-      <w:r>
-        <w:rPr>
-          <w:color w:val="000000" w:themeColor="text1"/>
-          <w:sz w:val="28"/>
-          <w:szCs w:val="28"/>
-        </w:rPr>
-        <w:t xml:space="preserve"> focuses on providing travel insights such as flight information, hotel comparisons, weather forecasts, budget estimation, and travel recommendations. The platform assists users in evaluating whether a destination is suitable for travel based on multiple factors rather than directly booking flights or hotels.</w:t>
+        </w:rPr>
+        <w:t>Unlike traditional travel booking websites, VoyageIQ focuses on providing travel insights such as flight information, hotel comparisons, weather forecasts, budget estimation, and travel recommendations. The platform assists users in evaluating whether a destination is suitable for travel based on multiple factors rather than directly booking flights or hotels.</w:t>
       </w:r>
     </w:p>
     <w:p>
@@ -619,6 +562,14 @@
         </w:rPr>
         <w:t>Prepare a foundation for future AI-powered travel recommendations</w:t>
       </w:r>
+      <w:r>
+        <w:rPr>
+          <w:color w:val="000000" w:themeColor="text1"/>
+          <w:sz w:val="28"/>
+          <w:szCs w:val="28"/>
+        </w:rPr>
+        <w:t>.</w:t>
+      </w:r>
     </w:p>
     <w:p>
       <w:pPr>
@@ -1005,25 +956,7 @@
           <w:sz w:val="28"/>
           <w:szCs w:val="28"/>
         </w:rPr>
-        <w:t>Open-</w:t>
-      </w:r>
-      <w:proofErr w:type="spellStart"/>
-      <w:r>
-        <w:rPr>
-          <w:color w:val="000000" w:themeColor="text1"/>
-          <w:sz w:val="28"/>
-          <w:szCs w:val="28"/>
-        </w:rPr>
-        <w:t>Meteo</w:t>
-      </w:r>
-      <w:proofErr w:type="spellEnd"/>
-      <w:r>
-        <w:rPr>
-          <w:color w:val="000000" w:themeColor="text1"/>
-          <w:sz w:val="28"/>
-          <w:szCs w:val="28"/>
-        </w:rPr>
-        <w:t xml:space="preserve"> Weather API</w:t>
+        <w:t>Open-Meteo Weather API</w:t>
       </w:r>
     </w:p>
     <w:p>
@@ -1159,23 +1092,13 @@
           <w:szCs w:val="28"/>
         </w:rPr>
       </w:pPr>
-      <w:proofErr w:type="spellStart"/>
-      <w:r>
-        <w:rPr>
-          <w:color w:val="000000" w:themeColor="text1"/>
-          <w:sz w:val="28"/>
-          <w:szCs w:val="28"/>
-        </w:rPr>
-        <w:t>VoyageIQ</w:t>
-      </w:r>
-      <w:proofErr w:type="spellEnd"/>
-      <w:r>
-        <w:rPr>
-          <w:color w:val="000000" w:themeColor="text1"/>
-          <w:sz w:val="28"/>
-          <w:szCs w:val="28"/>
-        </w:rPr>
-        <w:t xml:space="preserve"> follows a layered architecture to maintain scalability and code maintainability.</w:t>
+      <w:r>
+        <w:rPr>
+          <w:color w:val="000000" w:themeColor="text1"/>
+          <w:sz w:val="28"/>
+          <w:szCs w:val="28"/>
+        </w:rPr>
+        <w:t>VoyageIQ follows a layered architecture to maintain scalability and code maintainability.</w:t>
       </w:r>
     </w:p>
     <w:p>
@@ -2205,18 +2128,8 @@
           <w:sz w:val="28"/>
           <w:szCs w:val="28"/>
         </w:rPr>
-        <w:t xml:space="preserve"> Provide flight information between selected origins </w:t>
-      </w:r>
-      <w:proofErr w:type="gramStart"/>
-      <w:r>
-        <w:rPr>
-          <w:color w:val="000000" w:themeColor="text1"/>
-          <w:sz w:val="28"/>
-          <w:szCs w:val="28"/>
-        </w:rPr>
-        <w:t>and  destinations</w:t>
-      </w:r>
-      <w:proofErr w:type="gramEnd"/>
+        <w:t xml:space="preserve"> Provide flight information between selected origins and  destinations</w:t>
+      </w:r>
     </w:p>
     <w:p>
       <w:pPr>
@@ -3102,25 +3015,7 @@
           <w:sz w:val="28"/>
           <w:szCs w:val="28"/>
         </w:rPr>
-        <w:t>Open-</w:t>
-      </w:r>
-      <w:proofErr w:type="spellStart"/>
-      <w:r>
-        <w:rPr>
-          <w:color w:val="000000" w:themeColor="text1"/>
-          <w:sz w:val="28"/>
-          <w:szCs w:val="28"/>
-        </w:rPr>
-        <w:t>meteo</w:t>
-      </w:r>
-      <w:proofErr w:type="spellEnd"/>
-      <w:r>
-        <w:rPr>
-          <w:color w:val="000000" w:themeColor="text1"/>
-          <w:sz w:val="28"/>
-          <w:szCs w:val="28"/>
-        </w:rPr>
-        <w:t xml:space="preserve"> API</w:t>
+        <w:t>Open-meteo API</w:t>
       </w:r>
     </w:p>
     <w:p>
@@ -3335,25 +3230,7 @@
           <w:sz w:val="28"/>
           <w:szCs w:val="28"/>
         </w:rPr>
-        <w:t xml:space="preserve">  Weather condition </w:t>
-      </w:r>
-      <w:proofErr w:type="gramStart"/>
-      <w:r>
-        <w:rPr>
-          <w:color w:val="000000" w:themeColor="text1"/>
-          <w:sz w:val="28"/>
-          <w:szCs w:val="28"/>
-        </w:rPr>
-        <w:t>are</w:t>
-      </w:r>
-      <w:proofErr w:type="gramEnd"/>
-      <w:r>
-        <w:rPr>
-          <w:color w:val="000000" w:themeColor="text1"/>
-          <w:sz w:val="28"/>
-          <w:szCs w:val="28"/>
-        </w:rPr>
-        <w:t xml:space="preserve"> mapped to user-friendly recommendation and weather icons.</w:t>
+        <w:t xml:space="preserve">  Weather condition are mapped to user-friendly recommendation and weather icons.</w:t>
       </w:r>
     </w:p>
     <w:p>
@@ -3703,16 +3580,7 @@
           <w:szCs w:val="32"/>
           <w:u w:val="single"/>
         </w:rPr>
-        <w:t xml:space="preserve">5.6 </w:t>
-      </w:r>
-      <w:r>
-        <w:rPr>
-          <w:color w:val="000000" w:themeColor="text1"/>
-          <w:sz w:val="32"/>
-          <w:szCs w:val="32"/>
-          <w:u w:val="single"/>
-        </w:rPr>
-        <w:t>Dashboard Module</w:t>
+        <w:t>5.6 Dashboard Module</w:t>
       </w:r>
     </w:p>
     <w:p>
@@ -4099,7 +3967,6 @@
           <w:szCs w:val="32"/>
         </w:rPr>
       </w:pPr>
-      <w:proofErr w:type="spellStart"/>
       <w:r>
         <w:rPr>
           <w:b/>
@@ -4110,7 +3977,6 @@
         </w:rPr>
         <w:t>user_preferences</w:t>
       </w:r>
-      <w:proofErr w:type="spellEnd"/>
     </w:p>
     <w:p>
       <w:pPr>
@@ -4261,7 +4127,6 @@
           <w:szCs w:val="32"/>
         </w:rPr>
       </w:pPr>
-      <w:proofErr w:type="spellStart"/>
       <w:r>
         <w:rPr>
           <w:b/>
@@ -4272,7 +4137,6 @@
         </w:rPr>
         <w:t>weather_data</w:t>
       </w:r>
-      <w:proofErr w:type="spellEnd"/>
     </w:p>
     <w:p>
       <w:pPr>
@@ -4303,7 +4167,6 @@
           <w:szCs w:val="32"/>
         </w:rPr>
       </w:pPr>
-      <w:proofErr w:type="spellStart"/>
       <w:r>
         <w:rPr>
           <w:b/>
@@ -4314,7 +4177,6 @@
         </w:rPr>
         <w:t>target_trips</w:t>
       </w:r>
-      <w:proofErr w:type="spellEnd"/>
     </w:p>
     <w:p>
       <w:pPr>
@@ -4684,15 +4546,7 @@
           <w:sz w:val="32"/>
           <w:szCs w:val="32"/>
         </w:rPr>
-        <w:t xml:space="preserve">     </w:t>
-      </w:r>
-      <w:r>
-        <w:rPr>
-          <w:color w:val="000000" w:themeColor="text1"/>
-          <w:sz w:val="32"/>
-          <w:szCs w:val="32"/>
-        </w:rPr>
-        <w:t>Logged-In User</w:t>
+        <w:t xml:space="preserve">     Logged-In User</w:t>
       </w:r>
     </w:p>
     <w:p>
@@ -4995,7 +4849,7 @@
 </file>
 
 <file path=word/numbering.xml><?xml version="1.0" encoding="utf-8"?>
-<w:numbering xmlns:wpc="http://schemas.microsoft.com/office/word/2010/wordprocessingCanvas" xmlns:cx="http://schemas.microsoft.com/office/drawing/2014/chartex" xmlns:cx1="http://schemas.microsoft.com/office/drawing/2015/9/8/chartex" xmlns:cx2="http://schemas.microsoft.com/office/drawing/2015/10/21/chartex" xmlns:cx3="http://schemas.microsoft.com/office/drawing/2016/5/9/chartex" xmlns:cx4="http://schemas.microsoft.com/office/drawing/2016/5/10/chartex" xmlns:cx5="http://schemas.microsoft.com/office/drawing/2016/5/11/chartex" xmlns:cx6="http://schemas.microsoft.com/office/drawing/2016/5/12/chartex" xmlns:cx7="http://schemas.microsoft.com/office/drawing/2016/5/13/chartex" xmlns:cx8="http://schemas.microsoft.com/office/drawing/2016/5/14/chartex" xmlns:mc="http://schemas.openxmlformats.org/markup-compatibility/2006" xmlns:aink="http://schemas.microsoft.com/office/drawing/2016/ink" xmlns:am3d="http://schemas.microsoft.com/office/drawing/2017/model3d" xmlns:o="urn:schemas-microsoft-com:office:office" xmlns:oel="http://schemas.microsoft.com/office/2019/extlst" xmlns:r="http://schemas.openxmlformats.org/officeDocument/2006/relationships" xmlns:m="http://schemas.openxmlformats.org/officeDocument/2006/math" xmlns:v="urn:schemas-microsoft-com:vml" xmlns:wp14="http://schemas.microsoft.com/office/word/2010/wordprocessingDrawing" xmlns:wp="http://schemas.openxmlformats.org/drawingml/2006/wordprocessingDrawing" xmlns:w10="urn:schemas-microsoft-com:office:word" xmlns:w="http://schemas.openxmlformats.org/wordprocessingml/2006/main" xmlns:w14="http://schemas.microsoft.com/office/word/2010/wordml" xmlns:w15="http://schemas.microsoft.com/office/word/2012/wordml" xmlns:w16cex="http://schemas.microsoft.com/office/word/2018/wordml/cex" xmlns:w16cid="http://schemas.microsoft.com/office/word/2016/wordml/cid" xmlns:w16="http://schemas.microsoft.com/office/word/2018/wordml" xmlns:w16du="http://schemas.microsoft.com/office/word/2023/wordml/word16du" xmlns:w16sdtdh="http://schemas.microsoft.com/office/word/2020/wordml/sdtdatahash" xmlns:w16sdtfl="http://schemas.microsoft.com/office/word/2024/wordml/sdtformatlock" xmlns:w16se="http://schemas.microsoft.com/office/word/2015/wordml/symex" xmlns:wpg="http://schemas.microsoft.com/office/word/2010/wordprocessingGroup" xmlns:wpi="http://schemas.microsoft.com/office/word/2010/wordprocessingInk" xmlns:wne="http://schemas.microsoft.com/office/word/2006/wordml" xmlns:wps="http://schemas.microsoft.com/office/word/2010/wordprocessingShape" mc:Ignorable="w14 w15 w16se w16cid w16 w16cex w16sdtdh w16sdtfl w16du wp14">
+<w:numbering xmlns:wpc="http://schemas.microsoft.com/office/word/2010/wordprocessingCanvas" xmlns:cx="http://schemas.microsoft.com/office/drawing/2014/chartex" xmlns:cx1="http://schemas.microsoft.com/office/drawing/2015/9/8/chartex" xmlns:cx2="http://schemas.microsoft.com/office/drawing/2015/10/21/chartex" xmlns:cx3="http://schemas.microsoft.com/office/drawing/2016/5/9/chartex" xmlns:cx4="http://schemas.microsoft.com/office/drawing/2016/5/10/chartex" xmlns:cx5="http://schemas.microsoft.com/office/drawing/2016/5/11/chartex" xmlns:cx6="http://schemas.microsoft.com/office/drawing/2016/5/12/chartex" xmlns:cx7="http://schemas.microsoft.com/office/drawing/2016/5/13/chartex" xmlns:cx8="http://schemas.microsoft.com/office/drawing/2016/5/14/chartex" xmlns:mc="http://schemas.openxmlformats.org/markup-compatibility/2006" xmlns:aink="http://schemas.microsoft.com/office/drawing/2016/ink" xmlns:am3d="http://schemas.microsoft.com/office/drawing/2017/model3d" xmlns:o="urn:schemas-microsoft-com:office:office" xmlns:oel="http://schemas.microsoft.com/office/2019/extlst" xmlns:r="http://schemas.openxmlformats.org/officeDocument/2006/relationships" xmlns:m="http://schemas.openxmlformats.org/officeDocument/2006/math" xmlns:v="urn:schemas-microsoft-com:vml" xmlns:wp14="http://schemas.microsoft.com/office/word/2010/wordprocessingDrawing" xmlns:wp="http://schemas.openxmlformats.org/drawingml/2006/wordprocessingDrawing" xmlns:w10="urn:schemas-microsoft-com:office:word" xmlns:w="http://schemas.openxmlformats.org/wordprocessingml/2006/main" xmlns:w14="http://schemas.microsoft.com/office/word/2010/wordml" xmlns:w15="http://schemas.microsoft.com/office/word/2012/wordml" xmlns:w16cei="http://schemas.microsoft.com/office/word/2026/wordml/cei" xmlns:w16cex="http://schemas.microsoft.com/office/word/2018/wordml/cex" xmlns:w16cid="http://schemas.microsoft.com/office/word/2016/wordml/cid" xmlns:w16="http://schemas.microsoft.com/office/word/2018/wordml" xmlns:w16du="http://schemas.microsoft.com/office/word/2023/wordml/word16du" xmlns:w16sdtdh="http://schemas.microsoft.com/office/word/2020/wordml/sdtdatahash" xmlns:w16sdtfl="http://schemas.microsoft.com/office/word/2024/wordml/sdtformatlock" xmlns:w16se="http://schemas.microsoft.com/office/word/2015/wordml/symex" xmlns:wpg="http://schemas.microsoft.com/office/word/2010/wordprocessingGroup" xmlns:wpi="http://schemas.microsoft.com/office/word/2010/wordprocessingInk" xmlns:wne="http://schemas.microsoft.com/office/word/2006/wordml" xmlns:wps="http://schemas.microsoft.com/office/word/2010/wordprocessingShape" mc:Ignorable="w14 w15 w16se w16cid w16 w16cex w16sdtdh w16sdtfl w16du wp14">
   <w:abstractNum w:abstractNumId="0" w15:restartNumberingAfterBreak="0">
     <w:nsid w:val="068016FF"/>
     <w:multiLevelType w:val="hybridMultilevel"/>
@@ -9502,6 +9356,7 @@
   <w:style w:type="character" w:default="1" w:styleId="DefaultParagraphFont">
     <w:name w:val="Default Paragraph Font"/>
     <w:uiPriority w:val="1"/>
+    <w:semiHidden/>
     <w:unhideWhenUsed/>
   </w:style>
   <w:style w:type="table" w:default="1" w:styleId="TableNormal">

</xml_diff>